<commit_message>
complete end-to-end CRISP-DM pipeline with bonus clustering and presentation deck
</commit_message>
<xml_diff>
--- a/5 Hidden Traps Identified in the Data.docx
+++ b/5 Hidden Traps Identified in the Data.docx
@@ -170,51 +170,7 @@
           <w:szCs w:val="28"/>
           <w:u w:val="single"/>
         </w:rPr>
-        <w:t xml:space="preserve">Hidden Missing Values </w:t>
-      </w:r>
-      <w:r>
-        <w:rPr>
-          <w:b/>
-          <w:bCs/>
-          <w:color w:val="002060"/>
-          <w:sz w:val="28"/>
-          <w:szCs w:val="28"/>
-          <w:u w:val="single"/>
-        </w:rPr>
-        <w:t>“</w:t>
-      </w:r>
-      <w:r>
-        <w:rPr>
-          <w:b/>
-          <w:bCs/>
-          <w:color w:val="002060"/>
-          <w:sz w:val="28"/>
-          <w:szCs w:val="28"/>
-          <w:u w:val="single"/>
-        </w:rPr>
-        <w:t>(?)</w:t>
-      </w:r>
-      <w:r>
-        <w:rPr>
-          <w:b/>
-          <w:bCs/>
-          <w:color w:val="002060"/>
-          <w:sz w:val="28"/>
-          <w:szCs w:val="28"/>
-          <w:u w:val="single"/>
-        </w:rPr>
-        <w:t>”</w:t>
-      </w:r>
-      <w:r>
-        <w:rPr>
-          <w:b/>
-          <w:bCs/>
-          <w:color w:val="002060"/>
-          <w:sz w:val="28"/>
-          <w:szCs w:val="28"/>
-          <w:u w:val="single"/>
-        </w:rPr>
-        <w:t>:</w:t>
+        <w:t>Hidden Missing Values “(?)”:</w:t>
       </w:r>
     </w:p>
     <w:p>
@@ -428,8 +384,9 @@
           <w:szCs w:val="28"/>
           <w:u w:val="single"/>
         </w:rPr>
-        <w:t>Census Top-Coding at 99,999 in </w:t>
-      </w:r>
+        <w:t>Census Top-Coding at 99,999 in “</w:t>
+      </w:r>
+      <w:proofErr w:type="spellStart"/>
       <w:r>
         <w:rPr>
           <w:b/>
@@ -439,30 +396,7 @@
           <w:szCs w:val="28"/>
           <w:u w:val="single"/>
         </w:rPr>
-        <w:t>“</w:t>
-      </w:r>
-      <w:proofErr w:type="spellStart"/>
-      <w:r>
-        <w:rPr>
-          <w:b/>
-          <w:bCs/>
-          <w:color w:val="002060"/>
-          <w:sz w:val="28"/>
-          <w:szCs w:val="28"/>
-          <w:u w:val="single"/>
-        </w:rPr>
-        <w:t>capital</w:t>
-      </w:r>
-      <w:r>
-        <w:rPr>
-          <w:b/>
-          <w:bCs/>
-          <w:color w:val="002060"/>
-          <w:sz w:val="28"/>
-          <w:szCs w:val="28"/>
-          <w:u w:val="single"/>
-        </w:rPr>
-        <w:t>_gain</w:t>
+        <w:t>capital_gain</w:t>
       </w:r>
       <w:proofErr w:type="spellEnd"/>
       <w:r>
@@ -732,6 +666,725 @@
         </w:rPr>
         <w:t>Over 89% of records are United-States, while the remaining 41 countries have tiny frequencies. Keeping 42 one-hot columns would cause the curse of dimensionality.</w:t>
       </w:r>
+    </w:p>
+    <w:tbl>
+      <w:tblPr>
+        <w:tblStyle w:val="GridTable5Dark-Accent4"/>
+        <w:tblW w:w="9782" w:type="dxa"/>
+        <w:tblLayout w:type="fixed"/>
+        <w:tblLook w:val="04A0" w:firstRow="1" w:lastRow="0" w:firstColumn="1" w:lastColumn="0" w:noHBand="0" w:noVBand="1"/>
+      </w:tblPr>
+      <w:tblGrid>
+        <w:gridCol w:w="2066"/>
+        <w:gridCol w:w="2166"/>
+        <w:gridCol w:w="5550"/>
+      </w:tblGrid>
+      <w:tr>
+        <w:trPr>
+          <w:cnfStyle w:val="100000000000" w:firstRow="1" w:lastRow="0" w:firstColumn="0" w:lastColumn="0" w:oddVBand="0" w:evenVBand="0" w:oddHBand="0" w:evenHBand="0" w:firstRowFirstColumn="0" w:firstRowLastColumn="0" w:lastRowFirstColumn="0" w:lastRowLastColumn="0"/>
+          <w:trHeight w:val="753"/>
+        </w:trPr>
+        <w:tc>
+          <w:tcPr>
+            <w:cnfStyle w:val="001000000000" w:firstRow="0" w:lastRow="0" w:firstColumn="1" w:lastColumn="0" w:oddVBand="0" w:evenVBand="0" w:oddHBand="0" w:evenHBand="0" w:firstRowFirstColumn="0" w:firstRowLastColumn="0" w:lastRowFirstColumn="0" w:lastRowLastColumn="0"/>
+            <w:tcW w:w="2066" w:type="dxa"/>
+            <w:hideMark/>
+          </w:tcPr>
+          <w:p>
+            <w:pPr>
+              <w:rPr>
+                <w:sz w:val="28"/>
+                <w:szCs w:val="28"/>
+              </w:rPr>
+            </w:pPr>
+            <w:r>
+              <w:rPr>
+                <w:sz w:val="28"/>
+                <w:szCs w:val="28"/>
+              </w:rPr>
+              <w:lastRenderedPageBreak/>
+              <w:t>Problem in Data</w:t>
+            </w:r>
+          </w:p>
+        </w:tc>
+        <w:tc>
+          <w:tcPr>
+            <w:tcW w:w="2166" w:type="dxa"/>
+            <w:hideMark/>
+          </w:tcPr>
+          <w:p>
+            <w:pPr>
+              <w:cnfStyle w:val="100000000000" w:firstRow="1" w:lastRow="0" w:firstColumn="0" w:lastColumn="0" w:oddVBand="0" w:evenVBand="0" w:oddHBand="0" w:evenHBand="0" w:firstRowFirstColumn="0" w:firstRowLastColumn="0" w:lastRowFirstColumn="0" w:lastRowLastColumn="0"/>
+              <w:rPr>
+                <w:sz w:val="28"/>
+                <w:szCs w:val="28"/>
+              </w:rPr>
+            </w:pPr>
+            <w:r>
+              <w:rPr>
+                <w:sz w:val="28"/>
+                <w:szCs w:val="28"/>
+              </w:rPr>
+              <w:t>Naive / Bad Approach</w:t>
+            </w:r>
+          </w:p>
+        </w:tc>
+        <w:tc>
+          <w:tcPr>
+            <w:tcW w:w="5550" w:type="dxa"/>
+            <w:hideMark/>
+          </w:tcPr>
+          <w:p>
+            <w:pPr>
+              <w:cnfStyle w:val="100000000000" w:firstRow="1" w:lastRow="0" w:firstColumn="0" w:lastColumn="0" w:oddVBand="0" w:evenVBand="0" w:oddHBand="0" w:evenHBand="0" w:firstRowFirstColumn="0" w:firstRowLastColumn="0" w:lastRowFirstColumn="0" w:lastRowLastColumn="0"/>
+              <w:rPr>
+                <w:sz w:val="28"/>
+                <w:szCs w:val="28"/>
+              </w:rPr>
+            </w:pPr>
+            <w:r>
+              <w:rPr>
+                <w:sz w:val="28"/>
+                <w:szCs w:val="28"/>
+              </w:rPr>
+              <w:t>Our Rigorous Scientific Approach (With Justification)</w:t>
+            </w:r>
+          </w:p>
+        </w:tc>
+      </w:tr>
+      <w:tr>
+        <w:trPr>
+          <w:cnfStyle w:val="000000100000" w:firstRow="0" w:lastRow="0" w:firstColumn="0" w:lastColumn="0" w:oddVBand="0" w:evenVBand="0" w:oddHBand="1" w:evenHBand="0" w:firstRowFirstColumn="0" w:firstRowLastColumn="0" w:lastRowFirstColumn="0" w:lastRowLastColumn="0"/>
+          <w:trHeight w:val="3047"/>
+        </w:trPr>
+        <w:tc>
+          <w:tcPr>
+            <w:cnfStyle w:val="001000000000" w:firstRow="0" w:lastRow="0" w:firstColumn="1" w:lastColumn="0" w:oddVBand="0" w:evenVBand="0" w:oddHBand="0" w:evenHBand="0" w:firstRowFirstColumn="0" w:firstRowLastColumn="0" w:lastRowFirstColumn="0" w:lastRowLastColumn="0"/>
+            <w:tcW w:w="2066" w:type="dxa"/>
+            <w:hideMark/>
+          </w:tcPr>
+          <w:p>
+            <w:pPr>
+              <w:rPr>
+                <w:sz w:val="28"/>
+                <w:szCs w:val="28"/>
+              </w:rPr>
+            </w:pPr>
+            <w:r>
+              <w:rPr>
+                <w:sz w:val="28"/>
+                <w:szCs w:val="28"/>
+              </w:rPr>
+              <w:t xml:space="preserve">1. Missing Values (? in 3 </w:t>
+            </w:r>
+            <w:proofErr w:type="spellStart"/>
+            <w:r>
+              <w:rPr>
+                <w:sz w:val="28"/>
+                <w:szCs w:val="28"/>
+              </w:rPr>
+              <w:t>categoricals</w:t>
+            </w:r>
+            <w:proofErr w:type="spellEnd"/>
+            <w:r>
+              <w:rPr>
+                <w:sz w:val="28"/>
+                <w:szCs w:val="28"/>
+              </w:rPr>
+              <w:t>)</w:t>
+            </w:r>
+          </w:p>
+        </w:tc>
+        <w:tc>
+          <w:tcPr>
+            <w:tcW w:w="2166" w:type="dxa"/>
+            <w:hideMark/>
+          </w:tcPr>
+          <w:p>
+            <w:pPr>
+              <w:cnfStyle w:val="000000100000" w:firstRow="0" w:lastRow="0" w:firstColumn="0" w:lastColumn="0" w:oddVBand="0" w:evenVBand="0" w:oddHBand="1" w:evenHBand="0" w:firstRowFirstColumn="0" w:firstRowLastColumn="0" w:lastRowFirstColumn="0" w:lastRowLastColumn="0"/>
+              <w:rPr>
+                <w:b/>
+                <w:bCs/>
+                <w:sz w:val="28"/>
+                <w:szCs w:val="28"/>
+              </w:rPr>
+            </w:pPr>
+            <w:r>
+              <w:rPr>
+                <w:b/>
+                <w:bCs/>
+                <w:sz w:val="28"/>
+                <w:szCs w:val="28"/>
+              </w:rPr>
+              <w:t xml:space="preserve">Drop rows </w:t>
+            </w:r>
+            <w:proofErr w:type="gramStart"/>
+            <w:r>
+              <w:rPr>
+                <w:b/>
+                <w:bCs/>
+                <w:sz w:val="28"/>
+                <w:szCs w:val="28"/>
+              </w:rPr>
+              <w:t>with ?</w:t>
+            </w:r>
+            <w:proofErr w:type="gramEnd"/>
+            <w:r>
+              <w:rPr>
+                <w:b/>
+                <w:bCs/>
+                <w:sz w:val="28"/>
+                <w:szCs w:val="28"/>
+              </w:rPr>
+              <w:t> (losing ~7% of data).</w:t>
+            </w:r>
+          </w:p>
+        </w:tc>
+        <w:tc>
+          <w:tcPr>
+            <w:tcW w:w="5550" w:type="dxa"/>
+            <w:hideMark/>
+          </w:tcPr>
+          <w:p>
+            <w:pPr>
+              <w:cnfStyle w:val="000000100000" w:firstRow="0" w:lastRow="0" w:firstColumn="0" w:lastColumn="0" w:oddVBand="0" w:evenVBand="0" w:oddHBand="1" w:evenHBand="0" w:firstRowFirstColumn="0" w:firstRowLastColumn="0" w:lastRowFirstColumn="0" w:lastRowLastColumn="0"/>
+              <w:rPr>
+                <w:b/>
+                <w:bCs/>
+                <w:sz w:val="28"/>
+                <w:szCs w:val="28"/>
+              </w:rPr>
+            </w:pPr>
+            <w:r>
+              <w:rPr>
+                <w:b/>
+                <w:bCs/>
+                <w:sz w:val="28"/>
+                <w:szCs w:val="28"/>
+              </w:rPr>
+              <w:t>Mode Imputation or New Category 'Unknown': Since missingness is in </w:t>
+            </w:r>
+            <w:proofErr w:type="spellStart"/>
+            <w:r>
+              <w:rPr>
+                <w:b/>
+                <w:bCs/>
+                <w:sz w:val="28"/>
+                <w:szCs w:val="28"/>
+              </w:rPr>
+              <w:t>workclass</w:t>
+            </w:r>
+            <w:proofErr w:type="spellEnd"/>
+            <w:r>
+              <w:rPr>
+                <w:b/>
+                <w:bCs/>
+                <w:sz w:val="28"/>
+                <w:szCs w:val="28"/>
+              </w:rPr>
+              <w:t>, occupation, and </w:t>
+            </w:r>
+            <w:proofErr w:type="spellStart"/>
+            <w:r>
+              <w:rPr>
+                <w:b/>
+                <w:bCs/>
+                <w:sz w:val="28"/>
+                <w:szCs w:val="28"/>
+              </w:rPr>
+              <w:t>native_country</w:t>
+            </w:r>
+            <w:proofErr w:type="spellEnd"/>
+            <w:r>
+              <w:rPr>
+                <w:b/>
+                <w:bCs/>
+                <w:sz w:val="28"/>
+                <w:szCs w:val="28"/>
+              </w:rPr>
+              <w:t>, creating an 'Unknown' or imputing the most frequent category preserves all 32,561 rows without distorting the joint distribution.</w:t>
+            </w:r>
+          </w:p>
+        </w:tc>
+      </w:tr>
+      <w:tr>
+        <w:trPr>
+          <w:trHeight w:val="1908"/>
+        </w:trPr>
+        <w:tc>
+          <w:tcPr>
+            <w:cnfStyle w:val="001000000000" w:firstRow="0" w:lastRow="0" w:firstColumn="1" w:lastColumn="0" w:oddVBand="0" w:evenVBand="0" w:oddHBand="0" w:evenHBand="0" w:firstRowFirstColumn="0" w:firstRowLastColumn="0" w:lastRowFirstColumn="0" w:lastRowLastColumn="0"/>
+            <w:tcW w:w="2066" w:type="dxa"/>
+            <w:hideMark/>
+          </w:tcPr>
+          <w:p>
+            <w:pPr>
+              <w:rPr>
+                <w:sz w:val="28"/>
+                <w:szCs w:val="28"/>
+              </w:rPr>
+            </w:pPr>
+            <w:r>
+              <w:rPr>
+                <w:sz w:val="28"/>
+                <w:szCs w:val="28"/>
+              </w:rPr>
+              <w:t>2. Redundant Feature (education vs </w:t>
+            </w:r>
+            <w:proofErr w:type="spellStart"/>
+            <w:r>
+              <w:rPr>
+                <w:sz w:val="28"/>
+                <w:szCs w:val="28"/>
+              </w:rPr>
+              <w:t>education_num</w:t>
+            </w:r>
+            <w:proofErr w:type="spellEnd"/>
+            <w:r>
+              <w:rPr>
+                <w:sz w:val="28"/>
+                <w:szCs w:val="28"/>
+              </w:rPr>
+              <w:t>)</w:t>
+            </w:r>
+          </w:p>
+        </w:tc>
+        <w:tc>
+          <w:tcPr>
+            <w:tcW w:w="2166" w:type="dxa"/>
+            <w:hideMark/>
+          </w:tcPr>
+          <w:p>
+            <w:pPr>
+              <w:cnfStyle w:val="000000000000" w:firstRow="0" w:lastRow="0" w:firstColumn="0" w:lastColumn="0" w:oddVBand="0" w:evenVBand="0" w:oddHBand="0" w:evenHBand="0" w:firstRowFirstColumn="0" w:firstRowLastColumn="0" w:lastRowFirstColumn="0" w:lastRowLastColumn="0"/>
+              <w:rPr>
+                <w:b/>
+                <w:bCs/>
+                <w:sz w:val="28"/>
+                <w:szCs w:val="28"/>
+              </w:rPr>
+            </w:pPr>
+            <w:r>
+              <w:rPr>
+                <w:b/>
+                <w:bCs/>
+                <w:sz w:val="28"/>
+                <w:szCs w:val="28"/>
+              </w:rPr>
+              <w:t>Keep both.</w:t>
+            </w:r>
+          </w:p>
+        </w:tc>
+        <w:tc>
+          <w:tcPr>
+            <w:tcW w:w="5550" w:type="dxa"/>
+            <w:hideMark/>
+          </w:tcPr>
+          <w:p>
+            <w:pPr>
+              <w:cnfStyle w:val="000000000000" w:firstRow="0" w:lastRow="0" w:firstColumn="0" w:lastColumn="0" w:oddVBand="0" w:evenVBand="0" w:oddHBand="0" w:evenHBand="0" w:firstRowFirstColumn="0" w:firstRowLastColumn="0" w:lastRowFirstColumn="0" w:lastRowLastColumn="0"/>
+              <w:rPr>
+                <w:b/>
+                <w:bCs/>
+                <w:sz w:val="28"/>
+                <w:szCs w:val="28"/>
+              </w:rPr>
+            </w:pPr>
+            <w:r>
+              <w:rPr>
+                <w:b/>
+                <w:bCs/>
+                <w:sz w:val="28"/>
+                <w:szCs w:val="28"/>
+              </w:rPr>
+              <w:t>Drop education and keep </w:t>
+            </w:r>
+            <w:proofErr w:type="spellStart"/>
+            <w:r>
+              <w:rPr>
+                <w:b/>
+                <w:bCs/>
+                <w:sz w:val="28"/>
+                <w:szCs w:val="28"/>
+              </w:rPr>
+              <w:t>education_num</w:t>
+            </w:r>
+            <w:proofErr w:type="spellEnd"/>
+            <w:r>
+              <w:rPr>
+                <w:b/>
+                <w:bCs/>
+                <w:sz w:val="28"/>
+                <w:szCs w:val="28"/>
+              </w:rPr>
+              <w:t>: They are a 1-to-1 identical rank mapping. Keeping both causes exact multicollinearity.</w:t>
+            </w:r>
+          </w:p>
+        </w:tc>
+      </w:tr>
+      <w:tr>
+        <w:trPr>
+          <w:cnfStyle w:val="000000100000" w:firstRow="0" w:lastRow="0" w:firstColumn="0" w:lastColumn="0" w:oddVBand="0" w:evenVBand="0" w:oddHBand="1" w:evenHBand="0" w:firstRowFirstColumn="0" w:firstRowLastColumn="0" w:lastRowFirstColumn="0" w:lastRowLastColumn="0"/>
+          <w:trHeight w:val="2276"/>
+        </w:trPr>
+        <w:tc>
+          <w:tcPr>
+            <w:cnfStyle w:val="001000000000" w:firstRow="0" w:lastRow="0" w:firstColumn="1" w:lastColumn="0" w:oddVBand="0" w:evenVBand="0" w:oddHBand="0" w:evenHBand="0" w:firstRowFirstColumn="0" w:firstRowLastColumn="0" w:lastRowFirstColumn="0" w:lastRowLastColumn="0"/>
+            <w:tcW w:w="2066" w:type="dxa"/>
+            <w:hideMark/>
+          </w:tcPr>
+          <w:p>
+            <w:pPr>
+              <w:rPr>
+                <w:sz w:val="28"/>
+                <w:szCs w:val="28"/>
+              </w:rPr>
+            </w:pPr>
+            <w:r>
+              <w:rPr>
+                <w:sz w:val="28"/>
+                <w:szCs w:val="28"/>
+              </w:rPr>
+              <w:t>3. High Cardinality in </w:t>
+            </w:r>
+            <w:proofErr w:type="spellStart"/>
+            <w:r>
+              <w:rPr>
+                <w:sz w:val="28"/>
+                <w:szCs w:val="28"/>
+              </w:rPr>
+              <w:t>native_country</w:t>
+            </w:r>
+            <w:proofErr w:type="spellEnd"/>
+            <w:r>
+              <w:rPr>
+                <w:sz w:val="28"/>
+                <w:szCs w:val="28"/>
+              </w:rPr>
+              <w:t> (42 countries)</w:t>
+            </w:r>
+          </w:p>
+        </w:tc>
+        <w:tc>
+          <w:tcPr>
+            <w:tcW w:w="2166" w:type="dxa"/>
+            <w:hideMark/>
+          </w:tcPr>
+          <w:p>
+            <w:pPr>
+              <w:cnfStyle w:val="000000100000" w:firstRow="0" w:lastRow="0" w:firstColumn="0" w:lastColumn="0" w:oddVBand="0" w:evenVBand="0" w:oddHBand="1" w:evenHBand="0" w:firstRowFirstColumn="0" w:firstRowLastColumn="0" w:lastRowFirstColumn="0" w:lastRowLastColumn="0"/>
+              <w:rPr>
+                <w:b/>
+                <w:bCs/>
+                <w:sz w:val="28"/>
+                <w:szCs w:val="28"/>
+              </w:rPr>
+            </w:pPr>
+            <w:r>
+              <w:rPr>
+                <w:b/>
+                <w:bCs/>
+                <w:sz w:val="28"/>
+                <w:szCs w:val="28"/>
+              </w:rPr>
+              <w:t>42 one-hot columns (curse of dimensionality).</w:t>
+            </w:r>
+          </w:p>
+        </w:tc>
+        <w:tc>
+          <w:tcPr>
+            <w:tcW w:w="5550" w:type="dxa"/>
+            <w:hideMark/>
+          </w:tcPr>
+          <w:p>
+            <w:pPr>
+              <w:cnfStyle w:val="000000100000" w:firstRow="0" w:lastRow="0" w:firstColumn="0" w:lastColumn="0" w:oddVBand="0" w:evenVBand="0" w:oddHBand="1" w:evenHBand="0" w:firstRowFirstColumn="0" w:firstRowLastColumn="0" w:lastRowFirstColumn="0" w:lastRowLastColumn="0"/>
+              <w:rPr>
+                <w:b/>
+                <w:bCs/>
+                <w:sz w:val="28"/>
+                <w:szCs w:val="28"/>
+              </w:rPr>
+            </w:pPr>
+            <w:r>
+              <w:rPr>
+                <w:b/>
+                <w:bCs/>
+                <w:sz w:val="28"/>
+                <w:szCs w:val="28"/>
+              </w:rPr>
+              <w:t>Bin into Regions (United-States, Latin-America, Asia, Europe, Other): 89.6% of records are United-States. Binning prevents sparse matrices while preserving geopolitical economic signals.</w:t>
+            </w:r>
+          </w:p>
+        </w:tc>
+      </w:tr>
+      <w:tr>
+        <w:trPr>
+          <w:trHeight w:val="2662"/>
+        </w:trPr>
+        <w:tc>
+          <w:tcPr>
+            <w:cnfStyle w:val="001000000000" w:firstRow="0" w:lastRow="0" w:firstColumn="1" w:lastColumn="0" w:oddVBand="0" w:evenVBand="0" w:oddHBand="0" w:evenHBand="0" w:firstRowFirstColumn="0" w:firstRowLastColumn="0" w:lastRowFirstColumn="0" w:lastRowLastColumn="0"/>
+            <w:tcW w:w="2066" w:type="dxa"/>
+            <w:hideMark/>
+          </w:tcPr>
+          <w:p>
+            <w:pPr>
+              <w:rPr>
+                <w:sz w:val="28"/>
+                <w:szCs w:val="28"/>
+              </w:rPr>
+            </w:pPr>
+            <w:r>
+              <w:rPr>
+                <w:sz w:val="28"/>
+                <w:szCs w:val="28"/>
+              </w:rPr>
+              <w:t>4. Extreme Skew in </w:t>
+            </w:r>
+            <w:proofErr w:type="spellStart"/>
+            <w:r>
+              <w:rPr>
+                <w:sz w:val="28"/>
+                <w:szCs w:val="28"/>
+              </w:rPr>
+              <w:t>capital_gain</w:t>
+            </w:r>
+            <w:proofErr w:type="spellEnd"/>
+            <w:r>
+              <w:rPr>
+                <w:sz w:val="28"/>
+                <w:szCs w:val="28"/>
+              </w:rPr>
+              <w:t> / loss</w:t>
+            </w:r>
+          </w:p>
+        </w:tc>
+        <w:tc>
+          <w:tcPr>
+            <w:tcW w:w="2166" w:type="dxa"/>
+            <w:hideMark/>
+          </w:tcPr>
+          <w:p>
+            <w:pPr>
+              <w:cnfStyle w:val="000000000000" w:firstRow="0" w:lastRow="0" w:firstColumn="0" w:lastColumn="0" w:oddVBand="0" w:evenVBand="0" w:oddHBand="0" w:evenHBand="0" w:firstRowFirstColumn="0" w:firstRowLastColumn="0" w:lastRowFirstColumn="0" w:lastRowLastColumn="0"/>
+              <w:rPr>
+                <w:b/>
+                <w:bCs/>
+                <w:sz w:val="28"/>
+                <w:szCs w:val="28"/>
+              </w:rPr>
+            </w:pPr>
+            <w:r>
+              <w:rPr>
+                <w:b/>
+                <w:bCs/>
+                <w:sz w:val="28"/>
+                <w:szCs w:val="28"/>
+              </w:rPr>
+              <w:t>Apply standard Z-score scaling.</w:t>
+            </w:r>
+          </w:p>
+        </w:tc>
+        <w:tc>
+          <w:tcPr>
+            <w:tcW w:w="5550" w:type="dxa"/>
+            <w:hideMark/>
+          </w:tcPr>
+          <w:p>
+            <w:pPr>
+              <w:cnfStyle w:val="000000000000" w:firstRow="0" w:lastRow="0" w:firstColumn="0" w:lastColumn="0" w:oddVBand="0" w:evenVBand="0" w:oddHBand="0" w:evenHBand="0" w:firstRowFirstColumn="0" w:firstRowLastColumn="0" w:lastRowFirstColumn="0" w:lastRowLastColumn="0"/>
+              <w:rPr>
+                <w:b/>
+                <w:bCs/>
+                <w:sz w:val="28"/>
+                <w:szCs w:val="28"/>
+              </w:rPr>
+            </w:pPr>
+            <w:r>
+              <w:rPr>
+                <w:b/>
+                <w:bCs/>
+                <w:sz w:val="28"/>
+                <w:szCs w:val="28"/>
+              </w:rPr>
+              <w:t>Create binary flags (</w:t>
+            </w:r>
+            <w:proofErr w:type="spellStart"/>
+            <w:r>
+              <w:rPr>
+                <w:b/>
+                <w:bCs/>
+                <w:sz w:val="28"/>
+                <w:szCs w:val="28"/>
+              </w:rPr>
+              <w:t>has_capital_gain</w:t>
+            </w:r>
+            <w:proofErr w:type="spellEnd"/>
+            <w:r>
+              <w:rPr>
+                <w:b/>
+                <w:bCs/>
+                <w:sz w:val="28"/>
+                <w:szCs w:val="28"/>
+              </w:rPr>
+              <w:t>, </w:t>
+            </w:r>
+            <w:proofErr w:type="spellStart"/>
+            <w:r>
+              <w:rPr>
+                <w:b/>
+                <w:bCs/>
+                <w:sz w:val="28"/>
+                <w:szCs w:val="28"/>
+              </w:rPr>
+              <w:t>has_capital_loss</w:t>
+            </w:r>
+            <w:proofErr w:type="spellEnd"/>
+            <w:r>
+              <w:rPr>
+                <w:b/>
+                <w:bCs/>
+                <w:sz w:val="28"/>
+                <w:szCs w:val="28"/>
+              </w:rPr>
+              <w:t>) + Log-Transform np.log1</w:t>
+            </w:r>
+            <w:proofErr w:type="gramStart"/>
+            <w:r>
+              <w:rPr>
+                <w:b/>
+                <w:bCs/>
+                <w:sz w:val="28"/>
+                <w:szCs w:val="28"/>
+              </w:rPr>
+              <w:t>p(</w:t>
+            </w:r>
+            <w:proofErr w:type="gramEnd"/>
+            <w:r>
+              <w:rPr>
+                <w:b/>
+                <w:bCs/>
+                <w:sz w:val="28"/>
+                <w:szCs w:val="28"/>
+              </w:rPr>
+              <w:t>): 91.7% of entries are zero. A logarithmic transformation compresses the right tail and resolves extreme leverage points.</w:t>
+            </w:r>
+          </w:p>
+        </w:tc>
+      </w:tr>
+      <w:tr>
+        <w:trPr>
+          <w:cnfStyle w:val="000000100000" w:firstRow="0" w:lastRow="0" w:firstColumn="0" w:lastColumn="0" w:oddVBand="0" w:evenVBand="0" w:oddHBand="1" w:evenHBand="0" w:firstRowFirstColumn="0" w:firstRowLastColumn="0" w:lastRowFirstColumn="0" w:lastRowLastColumn="0"/>
+          <w:trHeight w:val="1908"/>
+        </w:trPr>
+        <w:tc>
+          <w:tcPr>
+            <w:cnfStyle w:val="001000000000" w:firstRow="0" w:lastRow="0" w:firstColumn="1" w:lastColumn="0" w:oddVBand="0" w:evenVBand="0" w:oddHBand="0" w:evenHBand="0" w:firstRowFirstColumn="0" w:firstRowLastColumn="0" w:lastRowFirstColumn="0" w:lastRowLastColumn="0"/>
+            <w:tcW w:w="2066" w:type="dxa"/>
+            <w:hideMark/>
+          </w:tcPr>
+          <w:p>
+            <w:pPr>
+              <w:rPr>
+                <w:sz w:val="28"/>
+                <w:szCs w:val="28"/>
+              </w:rPr>
+            </w:pPr>
+            <w:r>
+              <w:rPr>
+                <w:sz w:val="28"/>
+                <w:szCs w:val="28"/>
+              </w:rPr>
+              <w:t>5. Feature Scaling</w:t>
+            </w:r>
+          </w:p>
+        </w:tc>
+        <w:tc>
+          <w:tcPr>
+            <w:tcW w:w="2166" w:type="dxa"/>
+            <w:hideMark/>
+          </w:tcPr>
+          <w:p>
+            <w:pPr>
+              <w:cnfStyle w:val="000000100000" w:firstRow="0" w:lastRow="0" w:firstColumn="0" w:lastColumn="0" w:oddVBand="0" w:evenVBand="0" w:oddHBand="1" w:evenHBand="0" w:firstRowFirstColumn="0" w:firstRowLastColumn="0" w:lastRowFirstColumn="0" w:lastRowLastColumn="0"/>
+              <w:rPr>
+                <w:b/>
+                <w:bCs/>
+                <w:sz w:val="28"/>
+                <w:szCs w:val="28"/>
+              </w:rPr>
+            </w:pPr>
+            <w:proofErr w:type="spellStart"/>
+            <w:r>
+              <w:rPr>
+                <w:b/>
+                <w:bCs/>
+                <w:sz w:val="28"/>
+                <w:szCs w:val="28"/>
+              </w:rPr>
+              <w:t>StandardScaler</w:t>
+            </w:r>
+            <w:proofErr w:type="spellEnd"/>
+            <w:r>
+              <w:rPr>
+                <w:b/>
+                <w:bCs/>
+                <w:sz w:val="28"/>
+                <w:szCs w:val="28"/>
+              </w:rPr>
+              <w:t> (vulnerable to outliers).</w:t>
+            </w:r>
+          </w:p>
+        </w:tc>
+        <w:tc>
+          <w:tcPr>
+            <w:tcW w:w="5550" w:type="dxa"/>
+            <w:hideMark/>
+          </w:tcPr>
+          <w:p>
+            <w:pPr>
+              <w:cnfStyle w:val="000000100000" w:firstRow="0" w:lastRow="0" w:firstColumn="0" w:lastColumn="0" w:oddVBand="0" w:evenVBand="0" w:oddHBand="1" w:evenHBand="0" w:firstRowFirstColumn="0" w:firstRowLastColumn="0" w:lastRowFirstColumn="0" w:lastRowLastColumn="0"/>
+              <w:rPr>
+                <w:b/>
+                <w:bCs/>
+                <w:sz w:val="28"/>
+                <w:szCs w:val="28"/>
+              </w:rPr>
+            </w:pPr>
+            <w:proofErr w:type="spellStart"/>
+            <w:r>
+              <w:rPr>
+                <w:b/>
+                <w:bCs/>
+                <w:sz w:val="28"/>
+                <w:szCs w:val="28"/>
+              </w:rPr>
+              <w:t>RobustScaler</w:t>
+            </w:r>
+            <w:proofErr w:type="spellEnd"/>
+            <w:r>
+              <w:rPr>
+                <w:b/>
+                <w:bCs/>
+                <w:sz w:val="28"/>
+                <w:szCs w:val="28"/>
+              </w:rPr>
+              <w:t>: Uses median and IQR ($Q_3 - Q_1$), preventing the remaining heavy-tailed variables from distorting Euclidean distances in K-Means and linear weights.</w:t>
+            </w:r>
+          </w:p>
+        </w:tc>
+      </w:tr>
+    </w:tbl>
+    <w:p>
+      <w:pPr>
+        <w:pStyle w:val="ListParagraph"/>
+        <w:rPr>
+          <w:b/>
+          <w:bCs/>
+        </w:rPr>
+      </w:pPr>
     </w:p>
     <w:sectPr>
       <w:pgSz w:w="12240" w:h="15840"/>
@@ -1986,6 +2639,224 @@
       <w:spacing w:val="5"/>
     </w:rPr>
   </w:style>
+  <w:style w:type="table" w:styleId="TableGrid">
+    <w:name w:val="Table Grid"/>
+    <w:basedOn w:val="TableNormal"/>
+    <w:uiPriority w:val="39"/>
+    <w:rsid w:val="00E60345"/>
+    <w:pPr>
+      <w:spacing w:after="0" w:line="240" w:lineRule="auto"/>
+    </w:pPr>
+    <w:tblPr>
+      <w:tblBorders>
+        <w:top w:val="single" w:sz="4" w:space="0" w:color="auto"/>
+        <w:left w:val="single" w:sz="4" w:space="0" w:color="auto"/>
+        <w:bottom w:val="single" w:sz="4" w:space="0" w:color="auto"/>
+        <w:right w:val="single" w:sz="4" w:space="0" w:color="auto"/>
+        <w:insideH w:val="single" w:sz="4" w:space="0" w:color="auto"/>
+        <w:insideV w:val="single" w:sz="4" w:space="0" w:color="auto"/>
+      </w:tblBorders>
+    </w:tblPr>
+  </w:style>
+  <w:style w:type="table" w:styleId="PlainTable3">
+    <w:name w:val="Plain Table 3"/>
+    <w:basedOn w:val="TableNormal"/>
+    <w:uiPriority w:val="43"/>
+    <w:rsid w:val="00E60345"/>
+    <w:pPr>
+      <w:spacing w:after="0" w:line="240" w:lineRule="auto"/>
+    </w:pPr>
+    <w:tblPr>
+      <w:tblStyleRowBandSize w:val="1"/>
+      <w:tblStyleColBandSize w:val="1"/>
+    </w:tblPr>
+    <w:tblStylePr w:type="firstRow">
+      <w:rPr>
+        <w:b/>
+        <w:bCs/>
+        <w:caps/>
+      </w:rPr>
+      <w:tblPr/>
+      <w:tcPr>
+        <w:tcBorders>
+          <w:bottom w:val="single" w:sz="4" w:space="0" w:color="7F7F7F" w:themeColor="text1" w:themeTint="80"/>
+        </w:tcBorders>
+      </w:tcPr>
+    </w:tblStylePr>
+    <w:tblStylePr w:type="lastRow">
+      <w:rPr>
+        <w:b/>
+        <w:bCs/>
+        <w:caps/>
+      </w:rPr>
+      <w:tblPr/>
+      <w:tcPr>
+        <w:tcBorders>
+          <w:top w:val="nil"/>
+        </w:tcBorders>
+      </w:tcPr>
+    </w:tblStylePr>
+    <w:tblStylePr w:type="firstCol">
+      <w:rPr>
+        <w:b/>
+        <w:bCs/>
+        <w:caps/>
+      </w:rPr>
+      <w:tblPr/>
+      <w:tcPr>
+        <w:tcBorders>
+          <w:right w:val="single" w:sz="4" w:space="0" w:color="7F7F7F" w:themeColor="text1" w:themeTint="80"/>
+        </w:tcBorders>
+      </w:tcPr>
+    </w:tblStylePr>
+    <w:tblStylePr w:type="lastCol">
+      <w:rPr>
+        <w:b/>
+        <w:bCs/>
+        <w:caps/>
+      </w:rPr>
+      <w:tblPr/>
+      <w:tcPr>
+        <w:tcBorders>
+          <w:left w:val="nil"/>
+        </w:tcBorders>
+      </w:tcPr>
+    </w:tblStylePr>
+    <w:tblStylePr w:type="band1Vert">
+      <w:tblPr/>
+      <w:tcPr>
+        <w:shd w:val="clear" w:color="auto" w:fill="F2F2F2" w:themeFill="background1" w:themeFillShade="F2"/>
+      </w:tcPr>
+    </w:tblStylePr>
+    <w:tblStylePr w:type="band1Horz">
+      <w:tblPr/>
+      <w:tcPr>
+        <w:shd w:val="clear" w:color="auto" w:fill="F2F2F2" w:themeFill="background1" w:themeFillShade="F2"/>
+      </w:tcPr>
+    </w:tblStylePr>
+    <w:tblStylePr w:type="neCell">
+      <w:tblPr/>
+      <w:tcPr>
+        <w:tcBorders>
+          <w:left w:val="nil"/>
+        </w:tcBorders>
+      </w:tcPr>
+    </w:tblStylePr>
+    <w:tblStylePr w:type="nwCell">
+      <w:tblPr/>
+      <w:tcPr>
+        <w:tcBorders>
+          <w:right w:val="nil"/>
+        </w:tcBorders>
+      </w:tcPr>
+    </w:tblStylePr>
+  </w:style>
+  <w:style w:type="table" w:styleId="GridTable5Dark-Accent4">
+    <w:name w:val="Grid Table 5 Dark Accent 4"/>
+    <w:basedOn w:val="TableNormal"/>
+    <w:uiPriority w:val="50"/>
+    <w:rsid w:val="00E60345"/>
+    <w:pPr>
+      <w:spacing w:after="0" w:line="240" w:lineRule="auto"/>
+    </w:pPr>
+    <w:tblPr>
+      <w:tblStyleRowBandSize w:val="1"/>
+      <w:tblStyleColBandSize w:val="1"/>
+      <w:tblBorders>
+        <w:top w:val="single" w:sz="4" w:space="0" w:color="FFFFFF" w:themeColor="background1"/>
+        <w:left w:val="single" w:sz="4" w:space="0" w:color="FFFFFF" w:themeColor="background1"/>
+        <w:bottom w:val="single" w:sz="4" w:space="0" w:color="FFFFFF" w:themeColor="background1"/>
+        <w:right w:val="single" w:sz="4" w:space="0" w:color="FFFFFF" w:themeColor="background1"/>
+        <w:insideH w:val="single" w:sz="4" w:space="0" w:color="FFFFFF" w:themeColor="background1"/>
+        <w:insideV w:val="single" w:sz="4" w:space="0" w:color="FFFFFF" w:themeColor="background1"/>
+      </w:tblBorders>
+    </w:tblPr>
+    <w:tcPr>
+      <w:shd w:val="clear" w:color="auto" w:fill="CAEDFB" w:themeFill="accent4" w:themeFillTint="33"/>
+    </w:tcPr>
+    <w:tblStylePr w:type="firstRow">
+      <w:rPr>
+        <w:b/>
+        <w:bCs/>
+        <w:color w:val="FFFFFF" w:themeColor="background1"/>
+      </w:rPr>
+      <w:tblPr/>
+      <w:tcPr>
+        <w:tcBorders>
+          <w:top w:val="single" w:sz="4" w:space="0" w:color="FFFFFF" w:themeColor="background1"/>
+          <w:left w:val="single" w:sz="4" w:space="0" w:color="FFFFFF" w:themeColor="background1"/>
+          <w:right w:val="single" w:sz="4" w:space="0" w:color="FFFFFF" w:themeColor="background1"/>
+          <w:insideH w:val="nil"/>
+          <w:insideV w:val="nil"/>
+        </w:tcBorders>
+        <w:shd w:val="clear" w:color="auto" w:fill="0F9ED5" w:themeFill="accent4"/>
+      </w:tcPr>
+    </w:tblStylePr>
+    <w:tblStylePr w:type="lastRow">
+      <w:rPr>
+        <w:b/>
+        <w:bCs/>
+        <w:color w:val="FFFFFF" w:themeColor="background1"/>
+      </w:rPr>
+      <w:tblPr/>
+      <w:tcPr>
+        <w:tcBorders>
+          <w:left w:val="single" w:sz="4" w:space="0" w:color="FFFFFF" w:themeColor="background1"/>
+          <w:bottom w:val="single" w:sz="4" w:space="0" w:color="FFFFFF" w:themeColor="background1"/>
+          <w:right w:val="single" w:sz="4" w:space="0" w:color="FFFFFF" w:themeColor="background1"/>
+          <w:insideH w:val="nil"/>
+          <w:insideV w:val="nil"/>
+        </w:tcBorders>
+        <w:shd w:val="clear" w:color="auto" w:fill="0F9ED5" w:themeFill="accent4"/>
+      </w:tcPr>
+    </w:tblStylePr>
+    <w:tblStylePr w:type="firstCol">
+      <w:rPr>
+        <w:b/>
+        <w:bCs/>
+        <w:color w:val="FFFFFF" w:themeColor="background1"/>
+      </w:rPr>
+      <w:tblPr/>
+      <w:tcPr>
+        <w:tcBorders>
+          <w:top w:val="single" w:sz="4" w:space="0" w:color="FFFFFF" w:themeColor="background1"/>
+          <w:left w:val="single" w:sz="4" w:space="0" w:color="FFFFFF" w:themeColor="background1"/>
+          <w:bottom w:val="single" w:sz="4" w:space="0" w:color="FFFFFF" w:themeColor="background1"/>
+          <w:insideV w:val="nil"/>
+        </w:tcBorders>
+        <w:shd w:val="clear" w:color="auto" w:fill="0F9ED5" w:themeFill="accent4"/>
+      </w:tcPr>
+    </w:tblStylePr>
+    <w:tblStylePr w:type="lastCol">
+      <w:rPr>
+        <w:b/>
+        <w:bCs/>
+        <w:color w:val="FFFFFF" w:themeColor="background1"/>
+      </w:rPr>
+      <w:tblPr/>
+      <w:tcPr>
+        <w:tcBorders>
+          <w:top w:val="single" w:sz="4" w:space="0" w:color="FFFFFF" w:themeColor="background1"/>
+          <w:bottom w:val="single" w:sz="4" w:space="0" w:color="FFFFFF" w:themeColor="background1"/>
+          <w:right w:val="single" w:sz="4" w:space="0" w:color="FFFFFF" w:themeColor="background1"/>
+          <w:insideV w:val="nil"/>
+        </w:tcBorders>
+        <w:shd w:val="clear" w:color="auto" w:fill="0F9ED5" w:themeFill="accent4"/>
+      </w:tcPr>
+    </w:tblStylePr>
+    <w:tblStylePr w:type="band1Vert">
+      <w:tblPr/>
+      <w:tcPr>
+        <w:shd w:val="clear" w:color="auto" w:fill="95DCF7" w:themeFill="accent4" w:themeFillTint="66"/>
+      </w:tcPr>
+    </w:tblStylePr>
+    <w:tblStylePr w:type="band1Horz">
+      <w:tblPr/>
+      <w:tcPr>
+        <w:shd w:val="clear" w:color="auto" w:fill="95DCF7" w:themeFill="accent4" w:themeFillTint="66"/>
+      </w:tcPr>
+    </w:tblStylePr>
+  </w:style>
 </w:styles>
 </file>
 

</xml_diff>